<commit_message>
Clean Howard Dunbar source biography pilot
</commit_message>
<xml_diff>
--- a/content/Bios/Howard_Dunbar.docx
+++ b/content/Bios/Howard_Dunbar.docx
@@ -1,206 +1,8 @@
 
 <file path=word/document.xml><?xml version="1.0" encoding="utf-8"?>
-<w:document xmlns:w14="http://schemas.microsoft.com/office/word/2010/wordml" xmlns:wp14="http://schemas.microsoft.com/office/word/2010/wordprocessingDrawing" xmlns:w="http://schemas.openxmlformats.org/wordprocessingml/2006/main" xmlns:m="http://schemas.openxmlformats.org/officeDocument/2006/math" xmlns:r="http://schemas.openxmlformats.org/officeDocument/2006/relationships" xmlns:o="urn:schemas-microsoft-com:office:office" xmlns:v="urn:schemas-microsoft-com:vml" xmlns:w10="urn:schemas-microsoft-com:office:word" xmlns:a="http://schemas.openxmlformats.org/drawingml/2006/main" xmlns:pic="http://schemas.openxmlformats.org/drawingml/2006/picture" xmlns:wp="http://schemas.openxmlformats.org/drawingml/2006/wordprocessingDrawing" xmlns:mc="http://schemas.openxmlformats.org/markup-compatibility/2006" mc:Ignorable="w14 wp14">
+<w:document xmlns:ns1="http://schemas.openxmlformats.org/markup-compatibility/2006" xmlns:ns2="http://schemas.microsoft.com/office/word/2010/wordml" xmlns:w="http://schemas.openxmlformats.org/wordprocessingml/2006/main" ns1:Ignorable="w14 wp14">
   <w:body>
-    <w:p xmlns:wp14="http://schemas.microsoft.com/office/word/2010/wordml" wp14:textId="77777777">
-      <w:pPr>
-        <w:pStyle w:val="FirstParagraph"/>
-      </w:pPr>
-      <w:r>
-        <w:rPr/>
-        <w:t>1997 Hall of Fame Inductee Howard Dunbar – Cheyenne, Wyoming</w:t>
-      </w:r>
-      <w:r>
-        <w:rPr/>
-        <w:t xml:space="preserve"> </w:t>
-      </w:r>
-      <w:r>
-        <w:rPr/>
-        <w:t>The</w:t>
-      </w:r>
-      <w:r>
-        <w:rPr/>
-        <w:t xml:space="preserve"> late Howard Dunbar began his career as a sports official during a tour of duty with the U.S. Air</w:t>
-      </w:r>
-      <w:r>
-        <w:rPr/>
-        <w:t xml:space="preserve"> </w:t>
-      </w:r>
-      <w:r>
-        <w:rPr/>
-        <w:t>Force, then called the Army Air Corps, shortly after the end of World War II. During this time, he</w:t>
-      </w:r>
-      <w:r>
-        <w:rPr/>
-        <w:t xml:space="preserve"> </w:t>
-      </w:r>
-      <w:r>
-        <w:rPr/>
-        <w:t>served as Sports Commissioner for baseball, softball, basketball, and volleyball for U.S. personnel.</w:t>
-      </w:r>
-      <w:r>
-        <w:rPr/>
-        <w:t xml:space="preserve"> </w:t>
-      </w:r>
-      <w:r>
-        <w:rPr/>
-        <w:t>Upon his transfer to Warren Air Force Base in Cheyenne, he continued to officiate high school sports in</w:t>
-      </w:r>
-      <w:r>
-        <w:rPr/>
-        <w:t xml:space="preserve"> </w:t>
-      </w:r>
-      <w:r>
-        <w:rPr/>
-        <w:t>Wyoming as well as working in Nebraska and Colorado.</w:t>
-      </w:r>
-      <w:r>
-        <w:rPr/>
-        <w:t xml:space="preserve"> </w:t>
-      </w:r>
-      <w:r>
-        <w:rPr/>
-        <w:t>Howard also worked in the Western Athletic Conference as a football official. After a career spanning</w:t>
-      </w:r>
-      <w:r>
-        <w:rPr/>
-        <w:t xml:space="preserve"> </w:t>
-      </w:r>
-      <w:r>
-        <w:rPr/>
-        <w:t>59 years, Howard retired from officiating after a career which saw him work softball for 50 cents per</w:t>
-      </w:r>
-      <w:r>
-        <w:rPr/>
-        <w:t xml:space="preserve"> </w:t>
-      </w:r>
-      <w:r>
-        <w:rPr/>
-        <w:t xml:space="preserve">game (1934; the sport’s second year) and where he </w:t>
-      </w:r>
-      <w:r>
-        <w:rPr/>
-        <w:t>assisted</w:t>
-      </w:r>
-      <w:r>
-        <w:rPr/>
-        <w:t xml:space="preserve"> in the founding of the Eastern Wyoming</w:t>
-      </w:r>
-      <w:r>
-        <w:rPr/>
-        <w:t xml:space="preserve"> </w:t>
-      </w:r>
-      <w:r>
-        <w:rPr/>
-        <w:t>Sports Officials Association (in 1980).</w:t>
-      </w:r>
-      <w:r>
-        <w:rPr/>
-        <w:t xml:space="preserve"> </w:t>
-      </w:r>
-      <w:r>
-        <w:rPr/>
-        <w:t xml:space="preserve">His legacy </w:t>
-      </w:r>
-      <w:r>
-        <w:rPr/>
-        <w:t>to</w:t>
-      </w:r>
-      <w:r>
-        <w:rPr/>
-        <w:t xml:space="preserve"> </w:t>
-      </w:r>
-      <w:r>
-        <w:rPr/>
-        <w:t>the sport</w:t>
-      </w:r>
-      <w:r>
-        <w:rPr/>
-        <w:t xml:space="preserve"> also includes the naming of a sports facility in his honor. Dunbar Field was</w:t>
-      </w:r>
-      <w:r>
-        <w:rPr/>
-        <w:t xml:space="preserve"> </w:t>
-      </w:r>
-      <w:r>
-        <w:rPr/>
-        <w:t>created by Cheyenne City Council resolution in 1994 in honor of Howard’s</w:t>
-      </w:r>
-      <w:r>
-        <w:rPr/>
-        <w:t xml:space="preserve"> </w:t>
-      </w:r>
-      <w:r>
-        <w:rPr/>
-        <w:t>“outstanding citizenship</w:t>
-      </w:r>
-      <w:r>
-        <w:rPr/>
-        <w:t xml:space="preserve"> </w:t>
-      </w:r>
-      <w:r>
-        <w:rPr/>
-        <w:t>and contributions of time, energy and spirit to improve the quality of life in Cheyenne through its</w:t>
-      </w:r>
-      <w:r>
-        <w:rPr/>
-        <w:t xml:space="preserve"> </w:t>
-      </w:r>
-      <w:r>
-        <w:rPr/>
-        <w:t>sporting activities.”</w:t>
-      </w:r>
-      <w:r>
-        <w:rPr/>
-        <w:t xml:space="preserve"> </w:t>
-      </w:r>
-      <w:r>
-        <w:rPr/>
-        <w:t xml:space="preserve">Howard died December 30, </w:t>
-      </w:r>
-      <w:r>
-        <w:rPr/>
-        <w:t>1993</w:t>
-      </w:r>
-      <w:r>
-        <w:rPr/>
-        <w:t xml:space="preserve"> and is survived by his wife, </w:t>
-      </w:r>
-      <w:r>
-        <w:rPr/>
-        <w:t>Gwen</w:t>
-      </w:r>
-      <w:r>
-        <w:rPr/>
-        <w:t xml:space="preserve"> and a family of two girls and one</w:t>
-      </w:r>
-      <w:r>
-        <w:rPr/>
-        <w:t xml:space="preserve"> </w:t>
-      </w:r>
-      <w:r>
-        <w:rPr/>
-        <w:t>boy.</w:t>
-      </w:r>
-    </w:p>
-    <w:p>
-      <w:pPr>
-        <w:pStyle w:val="BodyText"/>
-      </w:pPr>
-    </w:p>
-    <w:p>
-      <w:pPr>
-        <w:pStyle w:val="Title"/>
-      </w:pPr>
-      <w:r>
-        <w:rPr>
-          <w:noProof w:val="0"/>
-          <w:lang w:val="en-US"/>
-        </w:rPr>
-        <w:t>Revised Biography: Howard Dunbar</w:t>
-      </w:r>
-    </w:p>
-    <w:p>
+    <w:p ns2:paraId="3F406433" ns2:textId="0376CEC2">
       <w:pPr>
         <w:pStyle w:val="Subtitle"/>
         <w:rPr/>
@@ -213,7 +15,7 @@
         <w:t>1997 Hall of Fame Inductee – Cheyenne, Wyoming</w:t>
       </w:r>
     </w:p>
-    <w:p>
+    <w:p ns2:paraId="5BC5C2ED" ns2:textId="4B6743B3">
       <w:pPr>
         <w:spacing w:before="0" w:beforeAutospacing="off" w:after="0" w:afterAutospacing="off" w:line="300" w:lineRule="auto"/>
         <w:rPr>
@@ -229,7 +31,7 @@
         </w:rPr>
       </w:pPr>
     </w:p>
-    <w:p>
+    <w:p ns2:paraId="4D5EB414" ns2:textId="6190DBCB">
       <w:pPr>
         <w:spacing w:before="0" w:beforeAutospacing="off" w:after="0" w:afterAutospacing="off" w:line="300" w:lineRule="auto"/>
         <w:rPr>
@@ -287,7 +89,7 @@
         <w:t>, then known as the Army Air Corps, shortly after World War II. During this time, he acted as Sports Commissioner for baseball, softball, basketball, and volleyball for U.S. personnel stationed overseas.</w:t>
       </w:r>
     </w:p>
-    <w:p>
+    <w:p ns2:paraId="6BA409DD" ns2:textId="6EFE9CE2">
       <w:pPr>
         <w:spacing w:before="0" w:beforeAutospacing="off" w:after="0" w:afterAutospacing="off" w:line="300" w:lineRule="auto"/>
         <w:rPr>
@@ -429,7 +231,7 @@
         <w:t>, further expanding his influence across the region.</w:t>
       </w:r>
     </w:p>
-    <w:p>
+    <w:p ns2:paraId="1F64F60E" ns2:textId="11E43A2A">
       <w:pPr>
         <w:spacing w:before="0" w:beforeAutospacing="off" w:after="0" w:afterAutospacing="off" w:line="300" w:lineRule="auto"/>
         <w:rPr>
@@ -515,7 +317,7 @@
         <w:t xml:space="preserve"> in his honor, citing his “outstanding citizenship and contributions of time, energy and spirit” to local sports.</w:t>
       </w:r>
     </w:p>
-    <w:p>
+    <w:p ns2:paraId="2503B17E" ns2:textId="42B1FEC6">
       <w:pPr>
         <w:spacing w:before="0" w:beforeAutospacing="off" w:after="0" w:afterAutospacing="off" w:line="300" w:lineRule="auto"/>
         <w:rPr>
@@ -545,7 +347,7 @@
         <w:t>Howard Dunbar passed away on December 30, 1993. He is survived by his wife, Gwen, and their three children—two daughters and one son.</w:t>
       </w:r>
     </w:p>
-    <w:p>
+    <w:p ns2:paraId="479EB88C" ns2:textId="2F5B5A59">
       <w:pPr>
         <w:pStyle w:val="BodyText"/>
       </w:pPr>

</xml_diff>